<commit_message>
Finalize diagnostic presentation and attribution
</commit_message>
<xml_diff>
--- a/artifacts/continuous-improvement/cause-countermeasure-diagnostic/releases/cause-countermeasure-diagnostic.docx
+++ b/artifacts/continuous-improvement/cause-countermeasure-diagnostic/releases/cause-countermeasure-diagnostic.docx
@@ -3404,13 +3404,200 @@
       </w:rPr>
       <w:t>.</w:t>
     </w:r>
+  </w:p>
+  <w:p>
+    <w:pPr>
+      <w:tabs>
+        <w:tab w:val="clear" w:pos="4680"/>
+        <w:tab w:val="clear" w:pos="9360"/>
+        <w:tab w:val="right" w:pos="10700"/>
+      </w:tabs>
+      <w:spacing w:before="20" w:line="160" w:lineRule="exact"/>
+      <w:rPr>
+        <w:sz w:val="13"/>
+        <w:szCs w:val="13"/>
+      </w:rPr>
+    </w:pPr>
     <w:r>
       <w:rPr>
+        <w:rFonts w:eastAsia="Aptos" w:cs="Aptos" w:ascii="Aptos" w:hAnsi="Aptos"/>
+        <w:color w:val="59636B"/>
+        <w:sz w:val="15"/>
+        <w:szCs w:val="15"/>
+        <w:smallCaps w:val="1"/>
+        <w:caps w:val="0"/>
+      </w:rPr>
+      <w:t xml:space="preserve">© 2026 </w:t>
+    </w:r>
+    <w:r>
+      <w:rPr>
+        <w:rFonts w:eastAsia="Aptos" w:cs="Aptos" w:ascii="Aptos" w:hAnsi="Aptos"/>
+        <w:smallCaps w:val="1"/>
+        <w:color w:val="59636B"/>
+        <w:sz w:val="15"/>
+        <w:szCs w:val="15"/>
+        <w:caps w:val="0"/>
+      </w:rPr>
+      <w:t>Daniel Venn</w:t>
+    </w:r>
+    <w:r>
+      <w:rPr>
+        <w:rFonts w:eastAsia="Aptos" w:cs="Aptos" w:ascii="Aptos" w:hAnsi="Aptos"/>
+        <w:color w:val="59636B"/>
+        <w:sz w:val="15"/>
+        <w:szCs w:val="15"/>
+        <w:smallCaps w:val="1"/>
+        <w:caps w:val="0"/>
+      </w:rPr>
+      <w:t xml:space="preserve"> | </w:t>
+    </w:r>
+    <w:proofErr w:type="spellStart"/>
+    <w:r>
+      <w:rPr>
+        <w:rFonts w:eastAsia="Aptos" w:cs="Aptos" w:ascii="Aptos" w:hAnsi="Aptos"/>
+        <w:bCs/>
+        <w:smallCaps w:val="1"/>
+        <w:color w:val="59636B"/>
+        <w:sz w:val="15"/>
+        <w:szCs w:val="15"/>
+        <w:caps w:val="0"/>
+      </w:rPr>
+      <w:t>WhatIf</w:t>
+    </w:r>
+    <w:r>
+      <w:rPr>
+        <w:rFonts w:eastAsia="Aptos" w:cs="Aptos" w:ascii="Aptos" w:hAnsi="Aptos"/>
+        <w:bCs/>
+        <w:smallCaps w:val="1"/>
+        <w:color w:val="E4AE55"/>
+        <w:sz w:val="15"/>
+        <w:szCs w:val="15"/>
+        <w:caps w:val="0"/>
+      </w:rPr>
+      <w:t>Works</w:t>
+    </w:r>
+    <w:proofErr w:type="spellEnd"/>
+    <w:r>
+      <w:rPr>
+        <w:rFonts w:eastAsia="Aptos" w:cs="Aptos" w:ascii="Aptos" w:hAnsi="Aptos"/>
+        <w:bCs/>
+        <w:smallCaps w:val="1"/>
+        <w:color w:val="59636B"/>
+        <w:sz w:val="15"/>
+        <w:szCs w:val="15"/>
+        <w:caps w:val="0"/>
+      </w:rPr>
+      <w:t xml:space="preserve"> | Open Lab</w:t>
+    </w:r>
+    <w:r>
+      <w:rPr>
         <w:rFonts w:eastAsia="Aptos" w:cs="Aptos"/>
-        <w:b/>
-        <w:sz w:val="15"/>
-      </w:rPr>
-      <w:br/>
+        <w:bCs/>
+        <w:color w:val="59636B"/>
+        <w:sz w:val="13"/>
+        <w:szCs w:val="13"/>
+      </w:rPr>
+      <w:t xml:space="preserve"> </w:t>
+    </w:r>
+    <w:r>
+      <w:rPr>
+        <w:rFonts w:eastAsia="Aptos" w:cs="Aptos"/>
+        <w:bCs/>
+        <w:color w:val="59636B"/>
+        <w:sz w:val="13"/>
+        <w:szCs w:val="13"/>
+      </w:rPr>
+      <w:tab/>
+    </w:r>
+    <w:r>
+      <w:rPr>
+        <w:rFonts w:eastAsia="Aptos" w:cs="Aptos"/>
+        <w:bCs/>
+        <w:color w:val="59636B"/>
+        <w:sz w:val="13"/>
+        <w:szCs w:val="13"/>
+      </w:rPr>
+    </w:r>
+    <w:r>
+      <w:rPr>
+        <w:rFonts w:eastAsia="Aptos" w:cs="Aptos"/>
+        <w:bCs/>
+        <w:color w:val="59636B"/>
+        <w:sz w:val="13"/>
+        <w:szCs w:val="13"/>
+      </w:rPr>
+    </w:r>
+    <w:r>
+      <w:rPr>
+        <w:rFonts w:eastAsia="Aptos" w:cs="Aptos"/>
+        <w:bCs/>
+        <w:color w:val="59636B"/>
+        <w:sz w:val="13"/>
+        <w:szCs w:val="13"/>
+      </w:rPr>
+    </w:r>
+    <w:r>
+      <w:rPr>
+        <w:rFonts w:eastAsia="Aptos" w:cs="Aptos"/>
+        <w:bCs/>
+        <w:color w:val="59636B"/>
+        <w:sz w:val="13"/>
+        <w:szCs w:val="13"/>
+      </w:rPr>
+    </w:r>
+    <w:r>
+      <w:rPr>
+        <w:rFonts w:eastAsia="Aptos" w:cs="Aptos"/>
+        <w:bCs/>
+        <w:color w:val="59636B"/>
+        <w:sz w:val="13"/>
+        <w:szCs w:val="13"/>
+      </w:rPr>
+    </w:r>
+    <w:r>
+      <w:rPr>
+        <w:rFonts w:eastAsia="Aptos" w:cs="Aptos"/>
+        <w:bCs/>
+        <w:color w:val="59636B"/>
+        <w:sz w:val="13"/>
+        <w:szCs w:val="13"/>
+      </w:rPr>
+    </w:r>
+    <w:r>
+      <w:rPr>
+        <w:rFonts w:eastAsia="Aptos" w:cs="Aptos"/>
+        <w:bCs/>
+        <w:color w:val="59636B"/>
+        <w:sz w:val="13"/>
+        <w:szCs w:val="13"/>
+      </w:rPr>
+    </w:r>
+    <w:r>
+      <w:rPr>
+        <w:rFonts w:eastAsia="Aptos" w:cs="Aptos"/>
+        <w:bCs/>
+        <w:color w:val="59636B"/>
+        <w:sz w:val="13"/>
+        <w:szCs w:val="13"/>
+      </w:rPr>
+    </w:r>
+    <w:r>
+      <w:rPr>
+        <w:rFonts w:eastAsia="Aptos" w:cs="Aptos"/>
+        <w:bCs/>
+        <w:color w:val="59636B"/>
+        <w:sz w:val="13"/>
+        <w:szCs w:val="13"/>
+      </w:rPr>
+    </w:r>
+    <w:r>
+      <w:rPr>
+        <w:rFonts w:eastAsia="Aptos" w:cs="Aptos"/>
+        <w:bCs/>
+        <w:color w:val="59636B"/>
+        <w:sz w:val="13"/>
+        <w:szCs w:val="13"/>
+      </w:rPr>
     </w:r>
     <w:r>
       <w:rPr>
@@ -3419,18 +3606,79 @@
         <w:smallCaps/>
         <w:color w:val="59636B"/>
         <w:sz w:val="13"/>
-      </w:rPr>
-      <w:t>WhatIf</w:t>
+        <w:szCs w:val="13"/>
+      </w:rPr>
+      <w:t>Page</w:t>
     </w:r>
     <w:r>
       <w:rPr>
         <w:rFonts w:eastAsia="Aptos" w:cs="Aptos"/>
         <w:bCs/>
-        <w:smallCaps/>
-        <w:color w:val="E4AE55"/>
+        <w:color w:val="59636B"/>
         <w:sz w:val="13"/>
-      </w:rPr>
-      <w:t>Works</w:t>
+        <w:szCs w:val="13"/>
+      </w:rPr>
+      <w:t xml:space="preserve"> </w:t>
+    </w:r>
+    <w:r>
+      <w:rPr>
+        <w:rFonts w:eastAsia="Aptos" w:cs="Aptos"/>
+        <w:bCs/>
+        <w:color w:val="59636B"/>
+        <w:sz w:val="13"/>
+        <w:szCs w:val="13"/>
+      </w:rPr>
+      <w:fldChar w:fldCharType="begin"/>
+    </w:r>
+    <w:r>
+      <w:rPr>
+        <w:rFonts w:eastAsia="Aptos" w:cs="Aptos"/>
+        <w:bCs/>
+        <w:color w:val="59636B"/>
+        <w:sz w:val="13"/>
+        <w:szCs w:val="13"/>
+      </w:rPr>
+      <w:instrText xml:space="preserve"> PAGE </w:instrText>
+    </w:r>
+    <w:r>
+      <w:rPr>
+        <w:rFonts w:eastAsia="Aptos" w:cs="Aptos"/>
+        <w:bCs/>
+        <w:color w:val="59636B"/>
+        <w:sz w:val="13"/>
+        <w:szCs w:val="13"/>
+      </w:rPr>
+      <w:fldChar w:fldCharType="separate"/>
+    </w:r>
+    <w:r>
+      <w:rPr>
+        <w:rFonts w:eastAsia="Aptos" w:cs="Aptos"/>
+        <w:bCs/>
+        <w:color w:val="59636B"/>
+        <w:sz w:val="13"/>
+        <w:szCs w:val="13"/>
+      </w:rPr>
+      <w:t>2</w:t>
+    </w:r>
+    <w:r>
+      <w:rPr>
+        <w:rFonts w:eastAsia="Aptos" w:cs="Aptos"/>
+        <w:bCs/>
+        <w:color w:val="59636B"/>
+        <w:sz w:val="13"/>
+        <w:szCs w:val="13"/>
+      </w:rPr>
+      <w:fldChar w:fldCharType="end"/>
+    </w:r>
+    <w:r>
+      <w:rPr>
+        <w:rFonts w:eastAsia="Aptos" w:cs="Aptos"/>
+        <w:bCs/>
+        <w:color w:val="59636B"/>
+        <w:sz w:val="13"/>
+        <w:szCs w:val="13"/>
+      </w:rPr>
+      <w:t xml:space="preserve"> </w:t>
     </w:r>
     <w:r>
       <w:rPr>
@@ -3439,152 +3687,17 @@
         <w:smallCaps/>
         <w:color w:val="59636B"/>
         <w:sz w:val="13"/>
-      </w:rPr>
-      <w:t xml:space="preserve"> | Open Lab</w:t>
+        <w:szCs w:val="13"/>
+      </w:rPr>
+      <w:t>Of</w:t>
     </w:r>
     <w:r>
       <w:rPr>
         <w:rFonts w:eastAsia="Aptos" w:cs="Aptos"/>
         <w:bCs/>
-        <w:smallCaps/>
         <w:color w:val="59636B"/>
         <w:sz w:val="13"/>
-      </w:rPr>
-      <w:tab/>
-    </w:r>
-    <w:r>
-      <w:rPr>
-        <w:rFonts w:eastAsia="Aptos" w:cs="Aptos"/>
-        <w:bCs/>
-        <w:smallCaps/>
-        <w:color w:val="59636B"/>
-        <w:sz w:val="13"/>
-      </w:rPr>
-      <w:tab/>
-    </w:r>
-    <w:r>
-      <w:rPr>
-        <w:rFonts w:eastAsia="Aptos" w:cs="Aptos"/>
-        <w:bCs/>
-        <w:color w:val="59636B"/>
-        <w:sz w:val="13"/>
-      </w:rPr>
-      <w:tab/>
-    </w:r>
-    <w:r>
-      <w:rPr>
-        <w:rFonts w:eastAsia="Aptos" w:cs="Aptos"/>
-        <w:bCs/>
-        <w:color w:val="59636B"/>
-        <w:sz w:val="13"/>
-      </w:rPr>
-      <w:tab/>
-    </w:r>
-    <w:r>
-      <w:rPr>
-        <w:rFonts w:eastAsia="Aptos" w:cs="Aptos"/>
-        <w:bCs/>
-        <w:color w:val="59636B"/>
-        <w:sz w:val="13"/>
-      </w:rPr>
-      <w:tab/>
-    </w:r>
-    <w:r>
-      <w:rPr>
-        <w:rFonts w:eastAsia="Aptos" w:cs="Aptos"/>
-        <w:bCs/>
-        <w:color w:val="59636B"/>
-        <w:sz w:val="13"/>
-      </w:rPr>
-      <w:tab/>
-    </w:r>
-    <w:r>
-      <w:rPr>
-        <w:rFonts w:eastAsia="Aptos" w:cs="Aptos"/>
-        <w:bCs/>
-        <w:color w:val="59636B"/>
-        <w:sz w:val="13"/>
-      </w:rPr>
-      <w:tab/>
-    </w:r>
-    <w:r>
-      <w:rPr>
-        <w:rFonts w:eastAsia="Aptos" w:cs="Aptos"/>
-        <w:bCs/>
-        <w:color w:val="59636B"/>
-        <w:sz w:val="13"/>
-      </w:rPr>
-      <w:tab/>
-    </w:r>
-    <w:r>
-      <w:rPr>
-        <w:rFonts w:eastAsia="Aptos" w:cs="Aptos"/>
-        <w:bCs/>
-        <w:color w:val="59636B"/>
-        <w:sz w:val="13"/>
-      </w:rPr>
-      <w:tab/>
-    </w:r>
-    <w:r>
-      <w:rPr>
-        <w:rFonts w:eastAsia="Aptos" w:cs="Aptos"/>
-        <w:bCs/>
-        <w:color w:val="59636B"/>
-        <w:sz w:val="13"/>
-      </w:rPr>
-      <w:tab/>
-    </w:r>
-    <w:r>
-      <w:rPr>
-        <w:rFonts w:eastAsia="Aptos" w:cs="Aptos"/>
-        <w:bCs/>
-        <w:color w:val="59636B"/>
-        <w:sz w:val="13"/>
-      </w:rPr>
-      <w:tab/>
-    </w:r>
-    <w:r>
-      <w:rPr>
-        <w:rFonts w:eastAsia="Aptos" w:cs="Aptos"/>
-        <w:bCs/>
-        <w:color w:val="59636B"/>
-        <w:sz w:val="13"/>
-      </w:rPr>
-      <w:tab/>
-    </w:r>
-    <w:r>
-      <w:rPr>
-        <w:rFonts w:eastAsia="Aptos" w:cs="Aptos"/>
-        <w:bCs/>
-        <w:color w:val="59636B"/>
-        <w:sz w:val="13"/>
-      </w:rPr>
-      <w:tab/>
-    </w:r>
-    <w:r>
-      <w:rPr>
-        <w:rFonts w:eastAsia="Aptos" w:cs="Aptos"/>
-        <w:bCs/>
-        <w:color w:val="59636B"/>
-        <w:sz w:val="13"/>
-      </w:rPr>
-      <w:t>P</w:t>
-    </w:r>
-    <w:r>
-      <w:rPr>
-        <w:rFonts w:eastAsia="Aptos" w:cs="Aptos"/>
-        <w:bCs/>
-        <w:color w:val="59636B"/>
-        <w:sz w:val="13"/>
-      </w:rPr>
-      <w:t>age</w:t>
-    </w:r>
-    <w:r>
-      <w:rPr>
-        <w:rFonts w:eastAsia="Aptos" w:cs="Aptos"/>
-        <w:bCs/>
-        <w:color w:val="59636B"/>
-        <w:sz w:val="13"/>
+        <w:szCs w:val="13"/>
       </w:rPr>
       <w:t xml:space="preserve"> </w:t>
     </w:r>
@@ -3594,6 +3707,7 @@
         <w:bCs/>
         <w:color w:val="59636B"/>
         <w:sz w:val="13"/>
+        <w:szCs w:val="13"/>
       </w:rPr>
       <w:fldChar w:fldCharType="begin"/>
     </w:r>
@@ -3603,8 +3717,9 @@
         <w:bCs/>
         <w:color w:val="59636B"/>
         <w:sz w:val="13"/>
-      </w:rPr>
-      <w:instrText xml:space="preserve"> PAGE </w:instrText>
+        <w:szCs w:val="13"/>
+      </w:rPr>
+      <w:instrText xml:space="preserve"> NUMPAGES  \* MERGEFORMAT </w:instrText>
     </w:r>
     <w:r>
       <w:rPr>
@@ -3612,6 +3727,7 @@
         <w:bCs/>
         <w:color w:val="59636B"/>
         <w:sz w:val="13"/>
+        <w:szCs w:val="13"/>
       </w:rPr>
       <w:fldChar w:fldCharType="separate"/>
     </w:r>
@@ -3621,6 +3737,7 @@
         <w:bCs/>
         <w:color w:val="59636B"/>
         <w:sz w:val="13"/>
+        <w:szCs w:val="13"/>
       </w:rPr>
       <w:t>2</w:t>
     </w:r>
@@ -3630,85 +3747,18 @@
         <w:bCs/>
         <w:color w:val="59636B"/>
         <w:sz w:val="13"/>
+        <w:szCs w:val="13"/>
       </w:rPr>
       <w:fldChar w:fldCharType="end"/>
     </w:r>
     <w:r>
       <w:rPr>
-        <w:rFonts w:eastAsia="Aptos" w:cs="Aptos"/>
-        <w:bCs/>
+        <w:rFonts w:eastAsia="Aptos" w:cs="Aptos" w:ascii="Aptos" w:hAnsi="Aptos"/>
         <w:color w:val="59636B"/>
-        <w:sz w:val="13"/>
-      </w:rPr>
-      <w:t xml:space="preserve"> OF </w:t>
-    </w:r>
-    <w:r>
-      <w:rPr>
-        <w:rFonts w:eastAsia="Aptos" w:cs="Aptos"/>
-        <w:bCs/>
-        <w:color w:val="59636B"/>
-        <w:sz w:val="13"/>
-      </w:rPr>
-      <w:fldChar w:fldCharType="begin"/>
-    </w:r>
-    <w:r>
-      <w:rPr>
-        <w:rFonts w:eastAsia="Aptos" w:cs="Aptos"/>
-        <w:bCs/>
-        <w:color w:val="59636B"/>
-        <w:sz w:val="13"/>
-      </w:rPr>
-      <w:instrText xml:space="preserve"> NUMPAGES  \* MERGEFORMAT </w:instrText>
-    </w:r>
-    <w:r>
-      <w:rPr>
-        <w:rFonts w:eastAsia="Aptos" w:cs="Aptos"/>
-        <w:bCs/>
-        <w:color w:val="59636B"/>
-        <w:sz w:val="13"/>
-      </w:rPr>
-      <w:fldChar w:fldCharType="separate"/>
-    </w:r>
-    <w:r>
-      <w:rPr>
-        <w:rFonts w:eastAsia="Aptos" w:cs="Aptos"/>
-        <w:bCs/>
-        <w:noProof/>
-        <w:color w:val="59636B"/>
-        <w:sz w:val="13"/>
-      </w:rPr>
-      <w:t>2</w:t>
-    </w:r>
-    <w:r>
-      <w:rPr>
-        <w:rFonts w:eastAsia="Aptos" w:cs="Aptos"/>
-        <w:bCs/>
-        <w:color w:val="59636B"/>
-        <w:sz w:val="13"/>
-      </w:rPr>
-      <w:fldChar w:fldCharType="end"/>
-    </w:r>
-  </w:p>
-  <w:p>
-    <w:pPr>
-      <w:spacing w:before="20" w:line="160" w:lineRule="exact"/>
-      <w:jc w:val="center"/>
-    </w:pPr>
-    <w:r>
-      <w:rPr>
-        <w:rFonts w:eastAsia="Aptos" w:cs="Aptos"/>
-        <w:color w:val="59636B"/>
-        <w:sz w:val="14"/>
-        <w:szCs w:val="14"/>
-      </w:rPr>
-      <w:t>© 2026 Daniel Venn | WhatIfWorks Open-Lab</w:t>
-    </w:r>
-    <w:r>
-      <w:rPr>
-        <w:rFonts w:eastAsia="Aptos" w:cs="Aptos"/>
-        <w:color w:val="59636B"/>
-        <w:sz w:val="14"/>
-        <w:szCs w:val="14"/>
+        <w:sz w:val="15"/>
+        <w:szCs w:val="15"/>
+        <w:smallCaps w:val="0"/>
+        <w:caps w:val="0"/>
       </w:rPr>
       <w:br/>
       <w:t>Licensed under CC BY-SA 4.0</w:t>
@@ -3721,31 +3771,42 @@
 <w:ftr xmlns:wpc="http://schemas.microsoft.com/office/word/2010/wordprocessingCanvas" xmlns:cx="http://schemas.microsoft.com/office/drawing/2014/chartex" xmlns:cx1="http://schemas.microsoft.com/office/drawing/2015/9/8/chartex" xmlns:cx2="http://schemas.microsoft.com/office/drawing/2015/10/21/chartex" xmlns:cx3="http://schemas.microsoft.com/office/drawing/2016/5/9/chartex" xmlns:cx4="http://schemas.microsoft.com/office/drawing/2016/5/10/chartex" xmlns:cx5="http://schemas.microsoft.com/office/drawing/2016/5/11/chartex" xmlns:cx6="http://schemas.microsoft.com/office/drawing/2016/5/12/chartex" xmlns:cx7="http://schemas.microsoft.com/office/drawing/2016/5/13/chartex" xmlns:cx8="http://schemas.microsoft.com/office/drawing/2016/5/14/chartex" xmlns:mc="http://schemas.openxmlformats.org/markup-compatibility/2006" xmlns:m="http://schemas.openxmlformats.org/officeDocument/2006/math" xmlns:aink="http://schemas.microsoft.com/office/drawing/2016/ink" xmlns:am3d="http://schemas.microsoft.com/office/drawing/2017/model3d" xmlns:oel="http://schemas.microsoft.com/office/2019/extlst" xmlns:r="http://schemas.openxmlformats.org/officeDocument/2006/relationships" xmlns:wp14="http://schemas.microsoft.com/office/word/2010/wordprocessingDrawing" xmlns:wp="http://schemas.openxmlformats.org/drawingml/2006/wordprocessingDrawing" xmlns:wpg="http://schemas.microsoft.com/office/word/2010/wordprocessingGroup" xmlns:wpi="http://schemas.microsoft.com/office/word/2010/wordprocessingInk" xmlns:wps="http://schemas.microsoft.com/office/word/2010/wordprocessingShape" xmlns:o="urn:schemas-microsoft-com:office:office" xmlns:v="urn:schemas-microsoft-com:vml" xmlns:w10="urn:schemas-microsoft-com:office:word" xmlns:w="http://schemas.openxmlformats.org/wordprocessingml/2006/main" xmlns:w14="http://schemas.microsoft.com/office/word/2010/wordml" xmlns:w15="http://schemas.microsoft.com/office/word/2012/wordml" xmlns:w16cex="http://schemas.microsoft.com/office/word/2018/wordml/cex" xmlns:w16cid="http://schemas.microsoft.com/office/word/2016/wordml/cid" xmlns:w16="http://schemas.microsoft.com/office/word/2018/wordml" xmlns:w16sdtdh="http://schemas.microsoft.com/office/word/2020/wordml/sdtdatahash" xmlns:w16sdtfl="http://schemas.microsoft.com/office/word/2024/wordml/sdtformatlock" xmlns:w16se="http://schemas.microsoft.com/office/word/2015/wordml/symex" xmlns:w16du="http://schemas.microsoft.com/office/word/2023/wordml/word16du" xmlns:wne="http://schemas.microsoft.com/office/word/2006/wordml" mc:Ignorable="w14 w15 w16se w16cid w16 w16cex w16sdtdh w16sdtfl w16du wp14">
   <w:p>
     <w:pPr>
-      <w:spacing w:before="40"/>
-      <w:jc w:val="center"/>
+      <w:pStyle w:val="Footer"/>
+    </w:pPr>
+    <w:proofErr w:type="spellStart"/>
+    <w:r>
       <w:rPr>
         <w:rFonts w:eastAsia="Aptos" w:cs="Aptos"/>
-        <w:b/>
-        <w:sz w:val="15"/>
-      </w:rPr>
-    </w:pPr>
-    <w:r>
-      <w:rPr>
-        <w:rFonts w:eastAsia="Aptos" w:cs="Aptos"/>
-        <w:bCs/>
+        <w:bCs/>
+        <w:smallCaps/>
         <w:color w:val="59636B"/>
         <w:sz w:val="13"/>
-      </w:rPr>
-      <w:t>WHATIF</w:t>
+        <w:szCs w:val="13"/>
+      </w:rPr>
+      <w:t>WhatIf</w:t>
     </w:r>
     <w:r>
       <w:rPr>
         <w:rFonts w:eastAsia="Aptos" w:cs="Aptos"/>
         <w:bCs/>
+        <w:smallCaps/>
         <w:color w:val="E4AE55"/>
         <w:sz w:val="13"/>
-      </w:rPr>
-      <w:t>WORKS</w:t>
+        <w:szCs w:val="13"/>
+      </w:rPr>
+      <w:t>Works</w:t>
+    </w:r>
+    <w:proofErr w:type="spellEnd"/>
+    <w:r>
+      <w:rPr>
+        <w:rFonts w:eastAsia="Aptos" w:cs="Aptos"/>
+        <w:bCs/>
+        <w:smallCaps/>
+        <w:color w:val="59636B"/>
+        <w:sz w:val="13"/>
+        <w:szCs w:val="13"/>
+      </w:rPr>
+      <w:t xml:space="preserve"> | Open Lab</w:t>
     </w:r>
     <w:r>
       <w:rPr>
@@ -3753,8 +3814,9 @@
         <w:bCs/>
         <w:color w:val="59636B"/>
         <w:sz w:val="13"/>
-      </w:rPr>
-      <w:t xml:space="preserve"> | OPEN LAB</w:t>
+        <w:szCs w:val="13"/>
+      </w:rPr>
+      <w:t xml:space="preserve"> </w:t>
     </w:r>
     <w:r>
       <w:rPr>
@@ -3762,6 +3824,7 @@
         <w:bCs/>
         <w:color w:val="59636B"/>
         <w:sz w:val="13"/>
+        <w:szCs w:val="13"/>
       </w:rPr>
       <w:tab/>
     </w:r>
@@ -3771,6 +3834,7 @@
         <w:bCs/>
         <w:color w:val="59636B"/>
         <w:sz w:val="13"/>
+        <w:szCs w:val="13"/>
       </w:rPr>
       <w:tab/>
     </w:r>
@@ -3780,6 +3844,7 @@
         <w:bCs/>
         <w:color w:val="59636B"/>
         <w:sz w:val="13"/>
+        <w:szCs w:val="13"/>
       </w:rPr>
       <w:tab/>
     </w:r>
@@ -3787,10 +3852,12 @@
       <w:rPr>
         <w:rFonts w:eastAsia="Aptos" w:cs="Aptos"/>
         <w:bCs/>
+        <w:smallCaps/>
         <w:color w:val="59636B"/>
         <w:sz w:val="13"/>
-      </w:rPr>
-      <w:tab/>
+        <w:szCs w:val="13"/>
+      </w:rPr>
+      <w:t>Page</w:t>
     </w:r>
     <w:r>
       <w:rPr>
@@ -3798,8 +3865,9 @@
         <w:bCs/>
         <w:color w:val="59636B"/>
         <w:sz w:val="13"/>
-      </w:rPr>
-      <w:tab/>
+        <w:szCs w:val="13"/>
+      </w:rPr>
+      <w:t xml:space="preserve"> </w:t>
     </w:r>
     <w:r>
       <w:rPr>
@@ -3807,69 +3875,7 @@
         <w:bCs/>
         <w:color w:val="59636B"/>
         <w:sz w:val="13"/>
-      </w:rPr>
-      <w:tab/>
-    </w:r>
-    <w:r>
-      <w:rPr>
-        <w:rFonts w:eastAsia="Aptos" w:cs="Aptos"/>
-        <w:bCs/>
-        <w:color w:val="59636B"/>
-        <w:sz w:val="13"/>
-      </w:rPr>
-      <w:tab/>
-    </w:r>
-    <w:r>
-      <w:rPr>
-        <w:rFonts w:eastAsia="Aptos" w:cs="Aptos"/>
-        <w:bCs/>
-        <w:color w:val="59636B"/>
-        <w:sz w:val="13"/>
-      </w:rPr>
-      <w:tab/>
-    </w:r>
-    <w:r>
-      <w:rPr>
-        <w:rFonts w:eastAsia="Aptos" w:cs="Aptos"/>
-        <w:bCs/>
-        <w:color w:val="59636B"/>
-        <w:sz w:val="13"/>
-      </w:rPr>
-      <w:tab/>
-    </w:r>
-    <w:r>
-      <w:rPr>
-        <w:rFonts w:eastAsia="Aptos" w:cs="Aptos"/>
-        <w:bCs/>
-        <w:color w:val="59636B"/>
-        <w:sz w:val="13"/>
-      </w:rPr>
-      <w:tab/>
-    </w:r>
-    <w:r>
-      <w:rPr>
-        <w:rFonts w:eastAsia="Aptos" w:cs="Aptos"/>
-        <w:bCs/>
-        <w:color w:val="59636B"/>
-        <w:sz w:val="13"/>
-      </w:rPr>
-      <w:tab/>
-    </w:r>
-    <w:r>
-      <w:rPr>
-        <w:rFonts w:eastAsia="Aptos" w:cs="Aptos"/>
-        <w:bCs/>
-        <w:color w:val="59636B"/>
-        <w:sz w:val="13"/>
-      </w:rPr>
-      <w:t xml:space="preserve">PAGE </w:t>
-    </w:r>
-    <w:r>
-      <w:rPr>
-        <w:rFonts w:eastAsia="Aptos" w:cs="Aptos"/>
-        <w:bCs/>
-        <w:color w:val="59636B"/>
-        <w:sz w:val="13"/>
+        <w:szCs w:val="13"/>
       </w:rPr>
       <w:fldChar w:fldCharType="begin"/>
     </w:r>
@@ -3879,6 +3885,7 @@
         <w:bCs/>
         <w:color w:val="59636B"/>
         <w:sz w:val="13"/>
+        <w:szCs w:val="13"/>
       </w:rPr>
       <w:instrText xml:space="preserve"> PAGE </w:instrText>
     </w:r>
@@ -3888,6 +3895,7 @@
         <w:bCs/>
         <w:color w:val="59636B"/>
         <w:sz w:val="13"/>
+        <w:szCs w:val="13"/>
       </w:rPr>
       <w:fldChar w:fldCharType="separate"/>
     </w:r>
@@ -3897,8 +3905,9 @@
         <w:bCs/>
         <w:color w:val="59636B"/>
         <w:sz w:val="13"/>
-      </w:rPr>
-      <w:t>1</w:t>
+        <w:szCs w:val="13"/>
+      </w:rPr>
+      <w:t>2</w:t>
     </w:r>
     <w:r>
       <w:rPr>
@@ -3906,6 +3915,7 @@
         <w:bCs/>
         <w:color w:val="59636B"/>
         <w:sz w:val="13"/>
+        <w:szCs w:val="13"/>
       </w:rPr>
       <w:fldChar w:fldCharType="end"/>
     </w:r>
@@ -3915,15 +3925,38 @@
         <w:bCs/>
         <w:color w:val="59636B"/>
         <w:sz w:val="13"/>
-      </w:rPr>
-      <w:t xml:space="preserve"> OF </w:t>
+        <w:szCs w:val="13"/>
+      </w:rPr>
+      <w:t xml:space="preserve"> </w:t>
     </w:r>
     <w:r>
       <w:rPr>
         <w:rFonts w:eastAsia="Aptos" w:cs="Aptos"/>
         <w:bCs/>
+        <w:smallCaps/>
         <w:color w:val="59636B"/>
         <w:sz w:val="13"/>
+        <w:szCs w:val="13"/>
+      </w:rPr>
+      <w:t>Of</w:t>
+    </w:r>
+    <w:r>
+      <w:rPr>
+        <w:rFonts w:eastAsia="Aptos" w:cs="Aptos"/>
+        <w:bCs/>
+        <w:color w:val="59636B"/>
+        <w:sz w:val="13"/>
+        <w:szCs w:val="13"/>
+      </w:rPr>
+      <w:t xml:space="preserve"> </w:t>
+    </w:r>
+    <w:r>
+      <w:rPr>
+        <w:rFonts w:eastAsia="Aptos" w:cs="Aptos"/>
+        <w:bCs/>
+        <w:color w:val="59636B"/>
+        <w:sz w:val="13"/>
+        <w:szCs w:val="13"/>
       </w:rPr>
       <w:fldChar w:fldCharType="begin"/>
     </w:r>
@@ -3933,6 +3966,7 @@
         <w:bCs/>
         <w:color w:val="59636B"/>
         <w:sz w:val="13"/>
+        <w:szCs w:val="13"/>
       </w:rPr>
       <w:instrText xml:space="preserve"> NUMPAGES  \* MERGEFORMAT </w:instrText>
     </w:r>
@@ -3942,6 +3976,7 @@
         <w:bCs/>
         <w:color w:val="59636B"/>
         <w:sz w:val="13"/>
+        <w:szCs w:val="13"/>
       </w:rPr>
       <w:fldChar w:fldCharType="separate"/>
     </w:r>
@@ -3949,9 +3984,9 @@
       <w:rPr>
         <w:rFonts w:eastAsia="Aptos" w:cs="Aptos"/>
         <w:bCs/>
-        <w:noProof/>
         <w:color w:val="59636B"/>
         <w:sz w:val="13"/>
+        <w:szCs w:val="13"/>
       </w:rPr>
       <w:t>2</w:t>
     </w:r>
@@ -3961,33 +3996,9 @@
         <w:bCs/>
         <w:color w:val="59636B"/>
         <w:sz w:val="13"/>
+        <w:szCs w:val="13"/>
       </w:rPr>
       <w:fldChar w:fldCharType="end"/>
-    </w:r>
-  </w:p>
-  <w:p>
-    <w:pPr>
-      <w:spacing w:before="20" w:line="160" w:lineRule="exact"/>
-      <w:jc w:val="center"/>
-    </w:pPr>
-    <w:r>
-      <w:rPr>
-        <w:rFonts w:eastAsia="Aptos" w:cs="Aptos"/>
-        <w:color w:val="59636B"/>
-        <w:sz w:val="14"/>
-        <w:szCs w:val="14"/>
-      </w:rPr>
-      <w:t>© 2026 Daniel Venn | WhatIfWorks Open-Lab</w:t>
-    </w:r>
-    <w:r>
-      <w:rPr>
-        <w:rFonts w:eastAsia="Aptos" w:cs="Aptos"/>
-        <w:color w:val="59636B"/>
-        <w:sz w:val="14"/>
-        <w:szCs w:val="14"/>
-      </w:rPr>
-      <w:br/>
-      <w:t>Licensed under CC BY-SA 4.0</w:t>
     </w:r>
   </w:p>
 </w:ftr>
@@ -4025,6 +4036,7 @@
         <w:szCs w:val="16"/>
       </w:rPr>
     </w:pPr>
+    <w:proofErr w:type="spellStart"/>
     <w:r>
       <w:rPr>
         <w:rFonts w:ascii="Aptos" w:hAnsi="Aptos"/>
@@ -4054,6 +4066,7 @@
       </w:rPr>
       <w:t>orks</w:t>
     </w:r>
+    <w:proofErr w:type="spellEnd"/>
     <w:r>
       <w:rPr>
         <w:rFonts w:ascii="Aptos" w:hAnsi="Aptos"/>
@@ -4134,6 +4147,7 @@
         <w:szCs w:val="16"/>
       </w:rPr>
     </w:pPr>
+    <w:proofErr w:type="spellStart"/>
     <w:r>
       <w:rPr>
         <w:rFonts w:ascii="Aptos" w:hAnsi="Aptos"/>
@@ -4163,6 +4177,7 @@
       </w:rPr>
       <w:t>orks</w:t>
     </w:r>
+    <w:proofErr w:type="spellEnd"/>
     <w:r>
       <w:rPr>
         <w:rFonts w:ascii="Aptos" w:hAnsi="Aptos"/>

</xml_diff>